<commit_message>
Add Docker configuration files and .dockerignore for project setup
</commit_message>
<xml_diff>
--- a/Звіт_ПЗ8.2_ТРПЗ.docx
+++ b/Звіт_ПЗ8.2_ТРПЗ.docx
@@ -936,7 +936,22 @@
           <w:sz w:val="24"/>
           <w:szCs w:val="24"/>
         </w:rPr>
-        <w:t xml:space="preserve">Альтернативою розглядався InnoSetup, однак він обмежений платформою Windows та потребує попереднього встановлення Node.js і PostgreSQL вручну, що ускладнює розгортання. Тому перевагу надано Docker Compose.</w:t>
+        <w:t xml:space="preserve">У межах дослідницького завдання проаналізовано популярні інструменти для створення інсталяцій ПЗ. InnoSetup — безкоштовний генератор інсталяторів зі скриптовою мовою; простий у використанні, однак обмежений платформою Windows та потребує попереднього встановлення Node.js і PostgreSQL вручну. NSIS (Nullsoft Scriptable Install System) — легкий інструмент з гнучкою скриптовою мовою, поширений для дистрибуції десктопних застосунків Windows; має ті самі платформні обмеження. WiX Toolset — створює пакети MSI для корпоративного розгортання через групові політики Windows, але має високий поріг входження. Для застосунків на базі Electron застосовується electron-builder, а у Linux-середовищах — нативні пакети deb/rpm, які, втім, прив’язані до конкретного дистрибутива.</w:t>
+      </w:r>
+    </w:p>
+    <w:p>
+      <w:pPr>
+        <w:spacing w:after="120" w:line="360"/>
+        <w:ind w:firstLine="720"/>
+        <w:jc w:val="both"/>
+      </w:pPr>
+      <w:r>
+        <w:rPr>
+          <w:rFonts w:ascii="Times New Roman" w:cs="Times New Roman" w:eastAsia="Times New Roman" w:hAnsi="Times New Roman"/>
+          <w:sz w:val="24"/>
+          <w:szCs w:val="24"/>
+        </w:rPr>
+        <w:t xml:space="preserve">Оскільки система OLIMP є клієнт-серверним веб-застосунком, що розгортається на сервері, а не на робочих станціях користувачів, перелічені генератори настільних інсталяторів не відповідають характеру продукту. Тому перевагу надано Docker Compose як кросплатформному інструменту серверного розгортання.</w:t>
       </w:r>
     </w:p>
     <w:p>
@@ -967,7 +982,7 @@
           <w:sz w:val="24"/>
           <w:szCs w:val="24"/>
         </w:rPr>
-        <w:t xml:space="preserve">Інсталяційний проект складається з двох файлів: Dockerfile та docker-compose.yml, розміщених у кореневому каталозі репозиторію.</w:t>
+        <w:t xml:space="preserve">Інсталяційний проект складається з трьох файлів, розміщених у кореневому каталозі репозиторію: Dockerfile, docker-compose.yml та .dockerignore (виключає з образу node_modules, .git, .env і документацію, що зменшує розмір образу та запобігає потраплянню секретів).</w:t>
       </w:r>
     </w:p>
     <w:p>
@@ -1425,6 +1440,34 @@
           <w:sz w:val="20"/>
           <w:szCs w:val="20"/>
         </w:rPr>
+        <w:t xml:space="preserve">    environment:</w:t>
+      </w:r>
+    </w:p>
+    <w:p>
+      <w:pPr>
+        <w:spacing w:after="40" w:line="280"/>
+        <w:ind w:left="720"/>
+      </w:pPr>
+      <w:r>
+        <w:rPr>
+          <w:rFonts w:ascii="Courier New" w:cs="Courier New" w:eastAsia="Courier New" w:hAnsi="Courier New"/>
+          <w:sz w:val="20"/>
+          <w:szCs w:val="20"/>
+        </w:rPr>
+        <w:t xml:space="preserve">      PGHOST: db</w:t>
+      </w:r>
+    </w:p>
+    <w:p>
+      <w:pPr>
+        <w:spacing w:after="40" w:line="280"/>
+        <w:ind w:left="720"/>
+      </w:pPr>
+      <w:r>
+        <w:rPr>
+          <w:rFonts w:ascii="Courier New" w:cs="Courier New" w:eastAsia="Courier New" w:hAnsi="Courier New"/>
+          <w:sz w:val="20"/>
+          <w:szCs w:val="20"/>
+        </w:rPr>
         <w:t xml:space="preserve">    depends_on:</w:t>
       </w:r>
     </w:p>
@@ -1504,7 +1547,7 @@
           <w:sz w:val="24"/>
           <w:szCs w:val="24"/>
         </w:rPr>
-        <w:t xml:space="preserve">Файл db/schema.sql монтується до каталогу docker-entrypoint-initdb.d контейнера PostgreSQL, що забезпечує автоматичне виконання DDL-скрипту та ініціалізацію структури бази даних без додаткових команд.</w:t>
+        <w:t xml:space="preserve">Файл db/schema.sql монтується до каталогу docker-entrypoint-initdb.d контейнера PostgreSQL, що забезпечує автоматичне виконання DDL-скрипту та ініціалізацію структури бази даних без додаткових команд. Змінна PGHOST перевизначається у секції environment значенням db, оскільки всередині мережі Docker Compose база даних доступна за іменем сервісу, а не за адресою localhost із файлу .env.</w:t>
       </w:r>
     </w:p>
     <w:p>
@@ -1822,7 +1865,7 @@
         <w:pStyle w:val="ListParagraph"/>
         <w:numPr>
           <w:ilvl w:val="0"/>
-          <w:numId w:val="3"/>
+          <w:numId w:val="4"/>
         </w:numPr>
         <w:spacing w:after="60" w:line="360"/>
         <w:jc w:val="both"/>
@@ -1841,7 +1884,7 @@
         <w:pStyle w:val="ListParagraph"/>
         <w:numPr>
           <w:ilvl w:val="0"/>
-          <w:numId w:val="3"/>
+          <w:numId w:val="4"/>
         </w:numPr>
         <w:spacing w:after="60" w:line="360"/>
         <w:jc w:val="both"/>
@@ -1860,7 +1903,7 @@
         <w:pStyle w:val="ListParagraph"/>
         <w:numPr>
           <w:ilvl w:val="0"/>
-          <w:numId w:val="3"/>
+          <w:numId w:val="4"/>
         </w:numPr>
         <w:spacing w:after="60" w:line="360"/>
         <w:jc w:val="both"/>
@@ -1879,7 +1922,7 @@
         <w:pStyle w:val="ListParagraph"/>
         <w:numPr>
           <w:ilvl w:val="0"/>
-          <w:numId w:val="3"/>
+          <w:numId w:val="4"/>
         </w:numPr>
         <w:spacing w:after="60" w:line="360"/>
         <w:jc w:val="both"/>
@@ -1898,7 +1941,7 @@
         <w:pStyle w:val="ListParagraph"/>
         <w:numPr>
           <w:ilvl w:val="0"/>
-          <w:numId w:val="3"/>
+          <w:numId w:val="4"/>
         </w:numPr>
         <w:spacing w:after="60" w:line="360"/>
         <w:jc w:val="both"/>
@@ -1917,7 +1960,7 @@
         <w:pStyle w:val="ListParagraph"/>
         <w:numPr>
           <w:ilvl w:val="0"/>
-          <w:numId w:val="3"/>
+          <w:numId w:val="4"/>
         </w:numPr>
         <w:spacing w:after="60" w:line="360"/>
         <w:jc w:val="both"/>
@@ -1936,7 +1979,7 @@
         <w:pStyle w:val="ListParagraph"/>
         <w:numPr>
           <w:ilvl w:val="0"/>
-          <w:numId w:val="3"/>
+          <w:numId w:val="4"/>
         </w:numPr>
         <w:spacing w:after="60" w:line="360"/>
         <w:jc w:val="both"/>
@@ -1955,7 +1998,7 @@
         <w:pStyle w:val="ListParagraph"/>
         <w:numPr>
           <w:ilvl w:val="0"/>
-          <w:numId w:val="3"/>
+          <w:numId w:val="4"/>
         </w:numPr>
         <w:spacing w:after="60" w:line="360"/>
         <w:jc w:val="both"/>
@@ -1974,7 +2017,7 @@
         <w:pStyle w:val="ListParagraph"/>
         <w:numPr>
           <w:ilvl w:val="0"/>
-          <w:numId w:val="3"/>
+          <w:numId w:val="4"/>
         </w:numPr>
         <w:spacing w:after="60" w:line="360"/>
         <w:jc w:val="both"/>
@@ -2199,6 +2242,12 @@
     </w:lvlOverride>
   </w:num>
   <w:num w:numId="3">
+    <w:abstractNumId w:val="3"/>
+    <w:lvlOverride w:ilvl="0">
+      <w:startOverride w:val="1"/>
+    </w:lvlOverride>
+  </w:num>
+  <w:num w:numId="4">
     <w:abstractNumId w:val="3"/>
     <w:lvlOverride w:ilvl="0">
       <w:startOverride w:val="1"/>

</xml_diff>